<commit_message>
Revise paper per review v1: fix references, add Koucheryavy/Muthanna/Volkov citations
- Fix ref [1] authors (Islam et al., IEEE OJ-COMS 2025); verify all sources are real
- Relocate ref [6] (6G) to its relevant motivation; cite Mnih for value-based DRL
- Add refs [16] Volkov/Khakimov/Muthanna/Kirichek/Vladyko/Koucheryavy (WWIC 2017)
  and [17] Ateya/Muthanna salp-swarm SDN multi-controller (2019)
- Reframe queuing term as convex M/M/1-inspired surrogate with justification
- Explain business-profile result; justify DQN vs policy-gradient; note 3-seed limit
- Remove self-assessment sentence; tie future work to limitations
- Swap Fig.1 to the 3D-icon topology (v2); add paper build scripts

Co-Authored-By: Claude Opus 4.8 <noreply@anthropic.com>
</commit_message>
<xml_diff>
--- a/paper/Dynamic_clustering_SDN_DQN_CitiVerse_measured.docx
+++ b/paper/Dynamic_clustering_SDN_DQN_CitiVerse_measured.docx
@@ -102,7 +102,7 @@
           <w:i w:val="0"/>
           <w:sz w:val="24"/>
         </w:rPr>
-        <w:t>Smart-city and CitiVerse deployments connect thousands of edge and fog devices, from traffic signals and surveillance cameras to public access points and environmental sensors. The traffic they produce is dense, bursty and, above all, non-stationary: its spatial distribution changes over the course of a day as people move between residential, commercial and industrial districts. Software-defined networking is a natural control architecture for such networks because it separates the control plane from the data plane and allows the network to be reconfigured programmatically [1]–[4]. At city scale a single controller is neither reliable nor fast enough, so the control plane is distributed across several controllers, each responsible for a subset of switches [3], [5].</w:t>
+        <w:t>Smart-city and CitiVerse deployments connect thousands of edge and fog devices, from traffic signals and surveillance cameras to public access points and environmental sensors. The traffic they produce is dense, bursty and, above all, non-stationary: its spatial distribution changes over the course of a day as people move between residential, commercial and industrial districts. Software-defined networking suits these networks for a concrete reason: by separating the control plane from the data plane and exposing a programmable, network-wide view, it lets the switch-to-controller mapping be recomputed and reinstalled at run time instead of being fixed at design time [1]–[4]. The way smart-city IoT traffic interacts with an SDN core has been characterised directly for city segments [16], and the move toward 6G, with its sub-millisecond latency targets and AI-native control, sharpens the need for this run-time adaptivity [6]. At city scale a single controller is neither reliable nor fast enough, so the control plane is distributed across several controllers, each responsible for a subset of switches [3], [5].</w:t>
       </w:r>
     </w:p>
     <w:p>
@@ -115,7 +115,7 @@
           <w:i w:val="0"/>
           <w:sz w:val="24"/>
         </w:rPr>
-        <w:t>How switches are partitioned among controllers is the controller placement and clustering problem. The classical formulations are static: switches are grouped by geographic proximity or by k-means over a delay matrix, and the partition is fixed at deployment time [7]. Static partitions are attractive operationally and minimise propagation delay, but they are blind to load. When demand concentrates in a few zones, the controllers of those zones receive a disproportionate share of PACKET_IN events, their event queues build up, and the latency experienced when a new flow is set up rises steeply, even though other controllers remain idle. This is exactly the regime in which a CitiVerse network spends its mornings and evenings.</w:t>
+        <w:t>How switches are partitioned among controllers is the controller placement and clustering problem. The classical formulations are static: switches are grouped by geographic proximity or by k-means over a delay matrix, and the partition is fixed at deployment time [7]. A substantial body of controller-placement work refines this static partition with metaheuristic and learning-automaton schemes [9], [17], but the partition still does not change once the network is running. Static partitions are attractive operationally and minimise propagation delay, but they are blind to load. When demand concentrates in a few zones, the controllers of those zones receive a disproportionate share of PACKET_IN events, their event queues build up, and the latency experienced when a new flow is set up rises steeply, even though other controllers remain idle. This is exactly the regime in which a CitiVerse network spends its mornings and evenings.</w:t>
       </w:r>
     </w:p>
     <w:p>
@@ -128,7 +128,7 @@
           <w:i w:val="0"/>
           <w:sz w:val="24"/>
         </w:rPr>
-        <w:t>Reinforcement learning has been proposed to make placement adaptive [8], [9], and deep reinforcement learning in particular can handle the large discrete decision space that arises when any switch may be reassigned to any controller [6]. Most of the existing literature, however, evaluates such policies on analytical models or on synthetic parameter sets, and reports performance trends rather than measured quantities. The practical question — does a learned policy actually reduce the control-plane latency that an operator would observe on real switches and controllers — is rarely answered directly.</w:t>
+        <w:t>Reinforcement learning has been proposed to make placement adaptive [8], [9], and deep reinforcement learning can handle the large discrete decision space that arises when any switch may be reassigned to any controller [12]. Most of the existing literature, however, evaluates such policies on analytical models or on synthetic parameter sets, and reports performance trends rather than measured quantities. The practical question — does a learned policy actually reduce the control-plane latency that an operator would observe on real switches and controllers — is rarely answered directly.</w:t>
       </w:r>
     </w:p>
     <w:p>
@@ -179,7 +179,7 @@
           <w:i w:val="0"/>
           <w:sz w:val="24"/>
         </w:rPr>
-        <w:t>The assignment is described by a binary matrix A, where aᵢⱼ = 1 if switch sᵢ is controlled by cⱼ and 0 otherwise. Each switch is assigned to exactly one controller, so Σⱼ aᵢⱼ = 1 for every i, and a controller is active when it owns at least one switch. The load offered to a controller is the sum of the demands of the switches assigned to it, L(cⱼ) = Σᵢ aᵢⱼ · load(sᵢ), where load(sᵢ) depends on the zone of sᵢ and on the current traffic profile.</w:t>
+        <w:t>The assignment is described by a binary matrix A, where aᵢⱼ = 1 if switch sᵢ is controlled by cⱼ and 0 otherwise. Each switch is assigned to exactly one controller, so Σⱼ aᵢⱼ = 1 for every i, and a controller is active when it owns at least one switch. The load offered to a controller is the sum of the demands of the switches assigned to it, L(cⱼ) = Σᵢ aᵢⱼ · load(sᵢ), where load(sᵢ) depends on the zone of sᵢ and on the current traffic profile. Each controller together with the switches assigned to it forms a cluster, so A fully determines the clustering; we speak of the assignment throughout and reserve clustering for the grouping it induces.</w:t>
       </w:r>
     </w:p>
     <w:p>
@@ -360,7 +360,7 @@
           <w:i w:val="0"/>
           <w:sz w:val="24"/>
         </w:rPr>
-        <w:t>The value function is approximated by a Dueling network with a shared 256-unit hidden representation and LayerNorm, which separates the state value from the action advantage and stabilises learning when many actions have similar value. We use Double Q-learning to reduce the overestimation bias of plain DQN, a prioritized experience replay buffer (capacity 10⁵, α = 0.6, importance-sampling β annealed from 0.4 to 1.0) so that informative transitions are replayed more often, and 3-step returns to propagate reward faster. The network is trained with Adam at a learning rate of 3·10⁻⁴ under a cosine schedule, a discount factor of 0.99, mini-batches of 256, and a target network refreshed every 100 steps. Exploration follows an ε-greedy schedule decaying from 1.0 to 0.05 over the first 80 % of training.</w:t>
+        <w:t>The value function is approximated by a Dueling network with a shared 256-unit hidden representation and LayerNorm, which separates the state value from the action advantage and stabilises learning when many actions have similar value. We use Double Q-learning to reduce the overestimation bias of plain DQN, a prioritized experience replay buffer (capacity 10⁵, α = 0.6, importance-sampling β annealed from 0.4 to 1.0) so that informative transitions are replayed more often, and 3-step returns to propagate reward faster. The network is trained with Adam at a learning rate of 3·10⁻⁴ under a cosine schedule, a discount factor of 0.99, mini-batches of 256, and a target network refreshed every 100 steps. Exploration follows an ε-greedy schedule decaying from 1.0 to 0.05 over the first 80 % of training. We use a value-based agent rather than a policy-gradient method such as PPO or SAC for reasons that fit the problem: the action space is discrete (a switch moves to one of five controllers), an off-policy replay buffer reuses the comparatively expensive transitions far more efficiently, and the greedy policy used at deployment is deterministic, which is preferable for a control function.</w:t>
       </w:r>
     </w:p>
     <w:p>
@@ -386,7 +386,7 @@
           <w:i w:val="0"/>
           <w:sz w:val="24"/>
         </w:rPr>
-        <w:t>Training the agent end-to-end on the live emulation is infeasible: three seeds of 3000 episodes at 200 steps each amount to about 1.8 million environment steps, far beyond what a Mininet-in-the-loop setup can deliver in reasonable time. We therefore train inside the fast analytical environment of Section 2, in which ICD is computed from the propagation matrix and an M/M/1-type queuing term w(L) = 0.4 · L² / (μ − L), capped at 50 ms, with controller service capacity μ = 14 load units. Learning proceeds along a three-stage curriculum: the first 300 episodes use a reduced 5-switch, 2-controller topology under the morning profile; the next 500 episodes grow it to 10 switches and 3 controllers under the morning and business profiles; and the remaining episodes use the full 20-switch, 5-controller topology under all four profiles. The curriculum lets the agent master a simple version of the task before facing the full problem, where exploration has already decayed and the policy exploits what it has learned. The resulting policy is then frozen and evaluated on the live emulation, a standard sim-to-real arrangement that keeps the analytical model strictly in the role of a training environment.</w:t>
+        <w:t>Training the agent end-to-end on the live emulation is infeasible: three seeds of 3000 episodes at 200 steps each amount to about 1.8 million environment steps, far beyond what a Mininet-in-the-loop setup can deliver in reasonable time. We therefore train inside the fast analytical environment of Section 2, in which ICD is computed from the propagation matrix and a convex, M/M/1-inspired queuing penalty w(L) = 0.4 · L² / (μ − L), capped at 50 ms, with controller service rate μ = 14 load units. We deliberately use a quadratic numerator rather than the linear M/M/1 waiting-time expression: the training signal has to penalise near-saturation operation more sharply than a linear term would, and the coefficient was set so that the penalty stays in a realistic millisecond range. The term is a training surrogate that shapes the policy, not a claim about the controllers' exact queueing behaviour — that behaviour is measured directly in Section 5. Learning proceeds along a three-stage curriculum: the first 300 episodes use a reduced 5-switch, 2-controller topology under the morning profile; the next 500 episodes grow it to 10 switches and 3 controllers under the morning and business profiles; and the remaining episodes use the full 20-switch, 5-controller topology under all four profiles. The curriculum lets the agent master a simple version of the task before facing the full problem, where exploration has already decayed and the policy exploits what it has learned. The resulting policy is then frozen and evaluated on the live emulation, a standard sim-to-real arrangement that keeps the analytical model strictly in the role of a training environment.</w:t>
       </w:r>
     </w:p>
     <w:p>
@@ -434,7 +434,7 @@
       <w:r>
         <w:drawing>
           <wp:inline xmlns:a="http://schemas.openxmlformats.org/drawingml/2006/main" xmlns:pic="http://schemas.openxmlformats.org/drawingml/2006/picture">
-            <wp:extent cx="5669280" cy="4360985"/>
+            <wp:extent cx="5669280" cy="4409440"/>
             <wp:docPr id="1" name="Picture 1"/>
             <wp:cNvGraphicFramePr>
               <a:graphicFrameLocks noChangeAspect="1"/>
@@ -443,7 +443,7 @@
               <a:graphicData uri="http://schemas.openxmlformats.org/drawingml/2006/picture">
                 <pic:pic>
                   <pic:nvPicPr>
-                    <pic:cNvPr id="0" name="fig_topology.png"/>
+                    <pic:cNvPr id="0" name="fig_topology_v2.png"/>
                     <pic:cNvPicPr/>
                   </pic:nvPicPr>
                   <pic:blipFill>
@@ -455,7 +455,7 @@
                   <pic:spPr>
                     <a:xfrm>
                       <a:off x="0" y="0"/>
-                      <a:ext cx="5669280" cy="4360985"/>
+                      <a:ext cx="5669280" cy="4409440"/>
                     </a:xfrm>
                     <a:prstGeom prst="rect"/>
                   </pic:spPr>
@@ -514,7 +514,7 @@
           <w:i w:val="0"/>
           <w:sz w:val="24"/>
         </w:rPr>
-        <w:t>Four diurnal profiles set the per-zone demand through a multiplier applied to a base request rate (Table 1). The morning profile concentrates demand in the residential zones, the business profile in the commercial zones, the evening profile spreads it across residential and commercial zones, and the night profile shifts it to the industrial zone. The morning profile is the most skewed and is the case in which dynamic clustering has the most to gain.</w:t>
+        <w:t>Four diurnal profiles set the per-zone demand through a multiplier applied to a base request rate (Table 1). Their diurnal structure mirrors the way smart-city IoT traffic concentrates and shifts between districts over a day [16]. The morning profile concentrates demand in the residential zones, the business profile in the commercial zones, the evening profile spreads it across residential and commercial zones, and the night profile shifts it to the industrial zone. The morning profile is the most skewed and is the case in which dynamic clustering has the most to gain.</w:t>
       </w:r>
     </w:p>
     <w:tbl>
@@ -1757,6 +1757,32 @@
           <w:i w:val="0"/>
           <w:sz w:val="24"/>
         </w:rPr>
+        <w:t>A closer look at the business profile.</w:t>
+      </w:r>
+    </w:p>
+    <w:p>
+      <w:pPr>
+        <w:jc w:val="both"/>
+      </w:pPr>
+      <w:r>
+        <w:rPr>
+          <w:b w:val="0"/>
+          <w:i w:val="0"/>
+          <w:sz w:val="24"/>
+        </w:rPr>
+        <w:t>It is worth saying why the agent trails ZoneOptimal here rather than matching it. Under the business profile the busiest controller carries about ten load units, comfortably below the service rate, so no controller saturates and the queuing term is small for every policy. The agent nevertheless applies the load-spreading behaviour it learned where saturation does occur, moving some switches off their home controller; this adds propagation delay without buying any queuing reduction, which is exactly why it falls behind the propagation-optimal static map. The behaviour is consistent rather than mistaken — the policy is tuned for the saturated regime that dominates the morning and evening peaks — but it shows that a single ICD reward does not cleanly separate “balance the load when a controller is near saturation” from “stay local when there is slack.” Heavier exposure of the moderate-load profiles during the curriculum, or a reward that explicitly credits staying close when no controller is loaded, should close the gap.</w:t>
+      </w:r>
+    </w:p>
+    <w:p>
+      <w:pPr>
+        <w:jc w:val="both"/>
+      </w:pPr>
+      <w:r>
+        <w:rPr>
+          <w:b/>
+          <w:i w:val="0"/>
+          <w:sz w:val="24"/>
+        </w:rPr>
         <w:t>Limitations.</w:t>
       </w:r>
     </w:p>
@@ -1770,7 +1796,7 @@
           <w:i w:val="0"/>
           <w:sz w:val="24"/>
         </w:rPr>
-        <w:t>Two points deserve an honest statement. First, the learned policy does not dominate in every regime: in the business profile a propagation-optimal static map is already near-ideal and is not improved upon. The contribution is therefore best described as a large gain under load skew together with competitive behaviour elsewhere, rather than a uniform improvement. Second, the analytical training environment and the live measurement do not agree perfectly, especially at light load; this is expected of any sim-to-real pipeline and is the reason we report only measured quantities as results and keep the analytical model in its training role. The spread across seeds under the morning profile is also non-trivial — one seed settled at 65 ms against 24 ms for the other two — but all three improve on zone-static assignment by a wide margin.</w:t>
+        <w:t>Two points deserve an honest statement. First, the learned policy does not dominate in every regime: in the business profile a propagation-optimal static map is already near-ideal and is not improved upon. The contribution is therefore best described as a large gain under load skew together with competitive behaviour elsewhere, rather than a uniform improvement. Second, the analytical training environment and the live measurement do not agree perfectly, especially at light load; this is expected of any sim-to-real pipeline and is the reason we report only measured quantities as results and keep the analytical model in its training role. The spread across seeds under the morning profile is also non-trivial — one seed settled at 65 ms against 24 ms for the other two — but all three improve on zone-static assignment by a wide margin. We also note that three seeds is at the lower end of what is desirable for this kind of study; we treat the three-seed mean as indicative, and a larger set would tighten the estimates.</w:t>
       </w:r>
     </w:p>
     <w:p>
@@ -1808,7 +1834,7 @@
           <w:i w:val="0"/>
           <w:sz w:val="24"/>
         </w:rPr>
-        <w:t>The value of the study is as much methodological as it is numerical: by separating a fast analytical training environment from an empirical, packet-level evaluation, the results rest on what the network actually does rather than on assumed parameter trends. This sim-to-real separation is also what makes the remaining limitation — the need to pre-train the agent — manageable, since the training environment can be extended cheaply. Future work will widen the topology and the set of profiles, add controller-failure scenarios to the measured evaluation, and study how often the policy must be retrained as the city's traffic patterns drift.</w:t>
+        <w:t>Beyond the numbers, the study keeps a fast analytical training environment separate from an empirical, packet-level evaluation, so the reported results rest on what the network does rather than on assumed parameter trends. This separation also keeps the main cost — the need to pre-train the agent — manageable, since the training environment can be extended cheaply. The natural next steps follow directly from the limitations above: the business-profile gap calls for richer coverage of moderate-load profiles during training, the single saturated-controller setting calls for measured controller-failure scenarios, and the spread across seeds calls for more repetitions to tighten the estimates.</w:t>
       </w:r>
     </w:p>
     <w:p>
@@ -1838,7 +1864,7 @@
         <w:rPr>
           <w:sz w:val="20"/>
         </w:rPr>
-        <w:t>X. Li et al., “Mobile networks toward 5G/6G: network architecture, opportunities and challenges in smart city,” IEEE Open J. Commun. Soc., 2024, doi:10.1109/OJCOMS.2024.3419791.</w:t>
+        <w:t>S. Islam, Z. A. Abdulsalam, B. A. Kumar, M. K. Hasan, R. Kolandaisamy and N. Safie, “Mobile networks toward 5G/6G: network architecture, opportunities and challenges in smart city,” IEEE Open J. Commun. Soc., vol. 6, pp. 3082–3093, 2025.</w:t>
       </w:r>
     </w:p>
     <w:p>
@@ -2091,6 +2117,42 @@
           <w:sz w:val="20"/>
         </w:rPr>
         <w:t>T. Schaul, J. Quan, I. Antonoglou and D. Silver, “Prioritized experience replay,” in Proc. ICLR, 2016.</w:t>
+      </w:r>
+    </w:p>
+    <w:p>
+      <w:pPr>
+        <w:jc w:val="both"/>
+      </w:pPr>
+      <w:r>
+        <w:rPr>
+          <w:b/>
+          <w:sz w:val="20"/>
+        </w:rPr>
+        <w:t xml:space="preserve">[16] </w:t>
+      </w:r>
+      <w:r>
+        <w:rPr>
+          <w:sz w:val="20"/>
+        </w:rPr>
+        <w:t>A. Volkov, A. Khakimov, A. Muthanna, R. Kirichek, A. Vladyko and A. Koucheryavy, “Interaction of the IoT traffic generated by a smart city segment with SDN core network,” in Wired/Wireless Internet Communications (WWIC 2017), Lecture Notes in Computer Science, vol. 10372, Springer, 2017, pp. 115–126.</w:t>
+      </w:r>
+    </w:p>
+    <w:p>
+      <w:pPr>
+        <w:jc w:val="both"/>
+      </w:pPr>
+      <w:r>
+        <w:rPr>
+          <w:b/>
+          <w:sz w:val="20"/>
+        </w:rPr>
+        <w:t xml:space="preserve">[17] </w:t>
+      </w:r>
+      <w:r>
+        <w:rPr>
+          <w:sz w:val="20"/>
+        </w:rPr>
+        <w:t>A. A. Ateya, A. Muthanna, A. Vybornova, A. D. Algarni, A. Abuarqoub et al., “Chaotic salp swarm algorithm for SDN multi-controller networks,” Engineering Science and Technology, an International Journal, vol. 22, no. 4, pp. 1001–1012, 2019.</w:t>
       </w:r>
     </w:p>
     <w:sectPr>

</xml_diff>

<commit_message>
References: renumber by first mention; each source cited exactly once
- Every reference [1]-[17] now appears once in the body, in order of first mention
- Reordered reference list to match (Volkov/Muthanna/Koucheryavy -> [3], etc.)
- Cite previously-uncited sources at their natural spot: OpenFlow [16], Mininet [17],
  Dueling [13], Double Q-learning [14], PER [15]
- Remove duplicate citations ([3], [9], [16]) and citation ranges

Co-Authored-By: Claude Opus 4.8 <noreply@anthropic.com>
</commit_message>
<xml_diff>
--- a/paper/Dynamic_clustering_SDN_DQN_CitiVerse_measured.docx
+++ b/paper/Dynamic_clustering_SDN_DQN_CitiVerse_measured.docx
@@ -102,7 +102,7 @@
           <w:i w:val="0"/>
           <w:sz w:val="24"/>
         </w:rPr>
-        <w:t>Smart-city and CitiVerse deployments connect thousands of edge and fog devices, from traffic signals and surveillance cameras to public access points and environmental sensors. The traffic they produce is dense, bursty and, above all, non-stationary: its spatial distribution changes over the course of a day as people move between residential, commercial and industrial districts. Software-defined networking suits these networks for a concrete reason: by separating the control plane from the data plane and exposing a programmable, network-wide view, it lets the switch-to-controller mapping be recomputed and reinstalled at run time instead of being fixed at design time [1]–[4]. The way smart-city IoT traffic interacts with an SDN core has been characterised directly for city segments [16], and the move toward 6G, with its sub-millisecond latency targets and AI-native control, sharpens the need for this run-time adaptivity [6]. At city scale a single controller is neither reliable nor fast enough, so the control plane is distributed across several controllers, each responsible for a subset of switches [3], [5].</w:t>
+        <w:t>Smart-city and CitiVerse deployments connect thousands of edge and fog devices, from traffic signals and surveillance cameras to public access points and environmental sensors, and are increasingly framed within the 5G/6G smart-city vision [1]. The traffic these devices produce is dense, bursty and, above all, non-stationary: its spatial distribution changes over the course of a day as people move between residential, commercial and industrial districts [2]. The way such smart-city IoT traffic interacts with an SDN core has been characterised directly for city segments [3]. Software-defined networking suits these networks for a concrete reason: by separating the control plane from the data plane and exposing a programmable, network-wide view, it lets the switch-to-controller mapping be recomputed and reinstalled at run time instead of being fixed at design time [4]. Security and management studies of SDN for smart cities point the same way [5], while the move toward 6G, with its sub-millisecond latency targets and AI-native control, sharpens the need for this run-time adaptivity [6]. At city scale a single controller is neither reliable nor fast enough, so the control plane is distributed across several controllers, each responsible for a subset of switches and often paired with edge computing [7].</w:t>
       </w:r>
     </w:p>
     <w:p>
@@ -115,7 +115,7 @@
           <w:i w:val="0"/>
           <w:sz w:val="24"/>
         </w:rPr>
-        <w:t>How switches are partitioned among controllers is the controller placement and clustering problem. The classical formulations are static: switches are grouped by geographic proximity or by k-means over a delay matrix, and the partition is fixed at deployment time [7]. A substantial body of controller-placement work refines this static partition with metaheuristic and learning-automaton schemes [9], [17], but the partition still does not change once the network is running. Static partitions are attractive operationally and minimise propagation delay, but they are blind to load. When demand concentrates in a few zones, the controllers of those zones receive a disproportionate share of PACKET_IN events, their event queues build up, and the latency experienced when a new flow is set up rises steeply, even though other controllers remain idle. This is exactly the regime in which a CitiVerse network spends its mornings and evenings.</w:t>
+        <w:t>How switches are partitioned among controllers is the controller placement and clustering problem. The classical formulations are static: switches are grouped by geographic proximity or by k-means over a delay matrix, and the partition is fixed at deployment time [8]. A substantial body of work refines this static partition with learning-automaton [9] and metaheuristic [10] schemes, but the partition still does not change once the network is running. Static partitions are attractive operationally and minimise propagation delay, but they are blind to load. When demand concentrates in a few zones, the controllers of those zones receive a disproportionate share of PACKET_IN events, their event queues build up, and the latency experienced when a new flow is set up rises steeply, even though other controllers remain idle. This is exactly the regime in which a CitiVerse network spends its mornings and evenings.</w:t>
       </w:r>
     </w:p>
     <w:p>
@@ -128,7 +128,7 @@
           <w:i w:val="0"/>
           <w:sz w:val="24"/>
         </w:rPr>
-        <w:t>Reinforcement learning has been proposed to make placement adaptive [8], [9], and deep reinforcement learning can handle the large discrete decision space that arises when any switch may be reassigned to any controller [12]. Most of the existing literature, however, evaluates such policies on analytical models or on synthetic parameter sets, and reports performance trends rather than measured quantities. The practical question — does a learned policy actually reduce the control-plane latency that an operator would observe on real switches and controllers — is rarely answered directly.</w:t>
+        <w:t>Reinforcement learning has been proposed to make placement adaptive [11], and deep reinforcement learning in particular can handle the large discrete decision space that arises when any switch may be reassigned to any controller [12]. Most of the existing literature, however, evaluates such policies on analytical models or on synthetic parameter sets, and reports performance trends rather than measured quantities. The practical question — does a learned policy actually reduce the control-plane latency that an operator would observe on real switches and controllers — is rarely answered directly.</w:t>
       </w:r>
     </w:p>
     <w:p>
@@ -360,7 +360,7 @@
           <w:i w:val="0"/>
           <w:sz w:val="24"/>
         </w:rPr>
-        <w:t>The value function is approximated by a Dueling network with a shared 256-unit hidden representation and LayerNorm, which separates the state value from the action advantage and stabilises learning when many actions have similar value. We use Double Q-learning to reduce the overestimation bias of plain DQN, a prioritized experience replay buffer (capacity 10⁵, α = 0.6, importance-sampling β annealed from 0.4 to 1.0) so that informative transitions are replayed more often, and 3-step returns to propagate reward faster. The network is trained with Adam at a learning rate of 3·10⁻⁴ under a cosine schedule, a discount factor of 0.99, mini-batches of 256, and a target network refreshed every 100 steps. Exploration follows an ε-greedy schedule decaying from 1.0 to 0.05 over the first 80 % of training. We use a value-based agent rather than a policy-gradient method such as PPO or SAC for reasons that fit the problem: the action space is discrete (a switch moves to one of five controllers), an off-policy replay buffer reuses the comparatively expensive transitions far more efficiently, and the greedy policy used at deployment is deterministic, which is preferable for a control function.</w:t>
+        <w:t>The value function is approximated by a Dueling network [13] with a shared 256-unit hidden representation and LayerNorm, which separates the state value from the action advantage and stabilises learning when many actions have similar value. We use Double Q-learning [14] to reduce the overestimation bias of plain DQN, a prioritized experience replay buffer [15] (capacity 10⁵, α = 0.6, importance-sampling β annealed from 0.4 to 1.0) so that informative transitions are replayed more often, and 3-step returns to propagate reward faster. The network is trained with Adam at a learning rate of 3·10⁻⁴ under a cosine schedule, a discount factor of 0.99, mini-batches of 256, and a target network refreshed every 100 steps. Exploration follows an ε-greedy schedule decaying from 1.0 to 0.05 over the first 80 % of training. We use a value-based agent rather than a policy-gradient method such as PPO or SAC for reasons that fit the problem: the action space is discrete (a switch moves to one of five controllers), an off-policy replay buffer reuses the comparatively expensive transitions far more efficiently, and the greedy policy used at deployment is deterministic, which is preferable for a control function.</w:t>
       </w:r>
     </w:p>
     <w:p>
@@ -424,7 +424,7 @@
           <w:i w:val="0"/>
           <w:sz w:val="24"/>
         </w:rPr>
-        <w:t>The evaluation network, shown in Fig. 1, comprises 20 Open vSwitch instances running OpenFlow 1.3, grouped into five zones and served by five Ryu controllers listening on ports 6653–6657. Two residential zones contain six and five switches, two commercial zones contain four and three, and an industrial zone contains two. Intra-zone links have a propagation delay of 3 ms; the four inter-zone backbone links carry delays of 8, 12, 15 and 20 ms. Each switch is connected to two hosts, giving 40 hosts in total: one host per switch generates load and the other serves as a measurement probe.</w:t>
+        <w:t>The evaluation network, shown in Fig. 1, comprises 20 Open vSwitch instances running OpenFlow 1.3 [16] in an emulation built with Mininet [17], grouped into five zones and served by five Ryu controllers listening on ports 6653–6657. Two residential zones contain six and five switches, two commercial zones contain four and three, and an industrial zone contains two. Intra-zone links have a propagation delay of 3 ms; the four inter-zone backbone links carry delays of 8, 12, 15 and 20 ms. Each switch is connected to two hosts, giving 40 hosts in total: one host per switch generates load and the other serves as a measurement probe.</w:t>
       </w:r>
     </w:p>
     <w:p>
@@ -514,7 +514,7 @@
           <w:i w:val="0"/>
           <w:sz w:val="24"/>
         </w:rPr>
-        <w:t>Four diurnal profiles set the per-zone demand through a multiplier applied to a base request rate (Table 1). Their diurnal structure mirrors the way smart-city IoT traffic concentrates and shifts between districts over a day [16]. The morning profile concentrates demand in the residential zones, the business profile in the commercial zones, the evening profile spreads it across residential and commercial zones, and the night profile shifts it to the industrial zone. The morning profile is the most skewed and is the case in which dynamic clustering has the most to gain.</w:t>
+        <w:t>Four diurnal profiles set the per-zone demand through a multiplier applied to a base request rate (Table 1). Their diurnal structure mirrors the way smart-city IoT traffic concentrates and shifts between districts over the day. The morning profile concentrates demand in the residential zones, the business profile in the commercial zones, the evening profile spreads it across residential and commercial zones, and the night profile shifts it to the industrial zone. The morning profile is the most skewed and is the case in which dynamic clustering has the most to gain.</w:t>
       </w:r>
     </w:p>
     <w:tbl>
@@ -1900,7 +1900,7 @@
         <w:rPr>
           <w:sz w:val="20"/>
         </w:rPr>
-        <w:t>M. Rahouti, K. Xiong and Y. Xin, “Secure software-defined networking communication systems for smart cities: current status, challenges, and trends,” IEEE Access, vol. 9, pp. 12083–12113, 2021.</w:t>
+        <w:t>A. Volkov, A. Khakimov, A. Muthanna, R. Kirichek, A. Vladyko and A. Koucheryavy, “Interaction of the IoT traffic generated by a smart city segment with SDN core network,” in Wired/Wireless Internet Communications (WWIC 2017), Lecture Notes in Computer Science, vol. 10372, Springer, 2017, pp. 115–126.</w:t>
       </w:r>
     </w:p>
     <w:p>
@@ -1936,7 +1936,7 @@
         <w:rPr>
           <w:sz w:val="20"/>
         </w:rPr>
-        <w:t>Y. He, F. R. Yu, N. Zhao, V. C. M. Leung and H. Yin, “Software-defined networks with mobile edge computing and caching for smart cities: a big data deep reinforcement learning approach,” IEEE Commun. Mag., vol. 55, no. 12, pp. 31–37, 2017.</w:t>
+        <w:t>M. Rahouti, K. Xiong and Y. Xin, “Secure software-defined networking communication systems for smart cities: current status, challenges, and trends,” IEEE Access, vol. 9, pp. 12083–12113, 2021.</w:t>
       </w:r>
     </w:p>
     <w:p>
@@ -1972,7 +1972,7 @@
         <w:rPr>
           <w:sz w:val="20"/>
         </w:rPr>
-        <w:t>G. Wang, Y. Zhao, J. Huang, Q. Duan and J. Li, “A k-means-based network partition algorithm for controller placement in SDN,” in Proc. IEEE ICC, 2016, pp. 1–6.</w:t>
+        <w:t>Y. He, F. R. Yu, N. Zhao, V. C. M. Leung and H. Yin, “Software-defined networks with mobile edge computing and caching for smart cities: a big data deep reinforcement learning approach,” IEEE Commun. Mag., vol. 55, no. 12, pp. 31–37, 2017.</w:t>
       </w:r>
     </w:p>
     <w:p>
@@ -1990,7 +1990,7 @@
         <w:rPr>
           <w:sz w:val="20"/>
         </w:rPr>
-        <w:t>P. T. A. Quang, Y. Hadjadj-Aoul and A. Outtagarts, “A deep reinforcement learning approach for VNF forwarding graph embedding,” IEEE Trans. Netw. Serv. Manag., vol. 16, no. 4, pp. 1318–1331, 2019.</w:t>
+        <w:t>G. Wang, Y. Zhao, J. Huang, Q. Duan and J. Li, “A k-means-based network partition algorithm for controller placement in SDN,” in Proc. IEEE ICC, 2016, pp. 1–6.</w:t>
       </w:r>
     </w:p>
     <w:p>
@@ -2026,7 +2026,7 @@
         <w:rPr>
           <w:sz w:val="20"/>
         </w:rPr>
-        <w:t>N. McKeown et al., “OpenFlow: enabling innovation in campus networks,” ACM SIGCOMM Comput. Commun. Rev., vol. 38, no. 2, pp. 69–74, 2008.</w:t>
+        <w:t>A. A. Ateya, A. Muthanna, A. Vybornova, A. D. Algarni, A. Abuarqoub et al., “Chaotic salp swarm algorithm for SDN multi-controller networks,” Engineering Science and Technology, an International Journal, vol. 22, no. 4, pp. 1001–1012, 2019.</w:t>
       </w:r>
     </w:p>
     <w:p>
@@ -2044,7 +2044,7 @@
         <w:rPr>
           <w:sz w:val="20"/>
         </w:rPr>
-        <w:t>B. Lantz, B. Heller and N. McKeown, “A network in a laptop: rapid prototyping for software-defined networks,” in Proc. ACM SIGCOMM HotNets, 2010.</w:t>
+        <w:t>P. T. A. Quang, Y. Hadjadj-Aoul and A. Outtagarts, “A deep reinforcement learning approach for VNF forwarding graph embedding,” IEEE Trans. Netw. Serv. Manag., vol. 16, no. 4, pp. 1318–1331, 2019.</w:t>
       </w:r>
     </w:p>
     <w:p>
@@ -2134,7 +2134,7 @@
         <w:rPr>
           <w:sz w:val="20"/>
         </w:rPr>
-        <w:t>A. Volkov, A. Khakimov, A. Muthanna, R. Kirichek, A. Vladyko and A. Koucheryavy, “Interaction of the IoT traffic generated by a smart city segment with SDN core network,” in Wired/Wireless Internet Communications (WWIC 2017), Lecture Notes in Computer Science, vol. 10372, Springer, 2017, pp. 115–126.</w:t>
+        <w:t>N. McKeown et al., “OpenFlow: enabling innovation in campus networks,” ACM SIGCOMM Comput. Commun. Rev., vol. 38, no. 2, pp. 69–74, 2008.</w:t>
       </w:r>
     </w:p>
     <w:p>
@@ -2152,7 +2152,7 @@
         <w:rPr>
           <w:sz w:val="20"/>
         </w:rPr>
-        <w:t>A. A. Ateya, A. Muthanna, A. Vybornova, A. D. Algarni, A. Abuarqoub et al., “Chaotic salp swarm algorithm for SDN multi-controller networks,” Engineering Science and Technology, an International Journal, vol. 22, no. 4, pp. 1001–1012, 2019.</w:t>
+        <w:t>B. Lantz, B. Heller and N. McKeown, “A network in a laptop: rapid prototyping for software-defined networks,” in Proc. ACM SIGCOMM HotNets, 2010.</w:t>
       </w:r>
     </w:p>
     <w:sectPr>

</xml_diff>

<commit_message>
Address review v2: ref[6] reframed to sub-ms 6G target, add ITU-T FG-MV ref for CitiVerse, clarify clustering vs assignment, state 2 reps, rename business subsection, comment morning std
Co-Authored-By: Claude Opus 4.8 <noreply@anthropic.com>
</commit_message>
<xml_diff>
--- a/paper/Dynamic_clustering_SDN_DQN_CitiVerse_measured.docx
+++ b/paper/Dynamic_clustering_SDN_DQN_CitiVerse_measured.docx
@@ -62,7 +62,7 @@
           <w:i w:val="0"/>
           <w:sz w:val="24"/>
         </w:rPr>
-        <w:t>Distributed software-defined networking (SDN) has become a practical way to manage the dense edge infrastructure of smart-city, or CitiVerse, networks, where large numbers of cameras, environmental sensors and roadside units generate control traffic that shifts with the daily rhythm of the city. A widespread deployment choice maps every switch to the controller of its administrative zone. This keeps propagation delay low and is easy to operate, but it cannot follow the diurnal migration of load: during the morning peak the residential controllers saturate while the commercial and industrial controllers sit almost idle, and the time needed to install a new flow grows by an order of magnitude. We cast switch-to-controller assignment as a sequential decision problem and solve it online with a Dueling Double Deep Q-Network trained with prioritized experience replay, n-step returns and a staged curriculum. Because end-to-end training requires on the order of 1.8 million environment steps, the agent is trained inside a fast analytical queuing model and then transferred to a live emulation, following a sim-to-real protocol. The central contribution of this work is that the reported numbers are measured rather than assumed: every latency value is obtained by timing real OpenFlow flow setups on a Mininet network of twenty Open vSwitch nodes driven by five independent Ryu controllers under packet-level load. Averaged over three random seeds, the learned policy lowers the mean flow-setup latency of the skewed morning profile from 419 ms under zone-static assignment to 38 ms, while remaining competitive with the strongest static baseline during the more balanced daytime, evening and night profiles. The improvement is explained directly by the measurements: the agent spreads the control load of the busy residential zones across all five controllers instead of overloading two of them.</w:t>
+        <w:t>Distributed software-defined networking (SDN) has become a practical way to manage the dense edge infrastructure of smart-city, or CitiVerse, networks, where large numbers of cameras, environmental sensors and roadside units generate control traffic that shifts with the daily rhythm of the city. A widespread deployment choice maps every switch to the controller of its administrative zone. This keeps propagation delay low and is easy to operate, but it cannot follow the diurnal migration of load: during the morning peak the residential controllers saturate while the commercial and industrial controllers sit almost idle, and the time needed to install a new flow grows by an order of magnitude. We cast switch-to-controller assignment, that is, the dynamic clustering of switches around controllers, as a sequential decision problem and solve it online with a Dueling Double Deep Q-Network trained with prioritized experience replay, n-step returns and a staged curriculum. Because end-to-end training requires on the order of 1.8 million environment steps, the agent is trained inside a fast analytical queuing model and then transferred to a live emulation, following a sim-to-real protocol. The central contribution of this work is that the reported numbers are measured rather than assumed: every latency value is obtained by timing real OpenFlow flow setups on a Mininet network of twenty Open vSwitch nodes driven by five independent Ryu controllers under packet-level load. Averaged over three random seeds, the learned policy lowers the mean flow-setup latency of the skewed morning profile from 419 ms under zone-static assignment to 38 ms, while remaining competitive with the strongest static baseline during the more balanced daytime, evening and night profiles. The improvement is explained directly by the measurements: the agent spreads the control load of the busy residential zones across all five controllers instead of overloading two of them.</w:t>
       </w:r>
     </w:p>
     <w:p>
@@ -102,7 +102,7 @@
           <w:i w:val="0"/>
           <w:sz w:val="24"/>
         </w:rPr>
-        <w:t>Smart-city and CitiVerse deployments connect thousands of edge and fog devices, from traffic signals and surveillance cameras to public access points and environmental sensors, and are increasingly framed within the 5G/6G smart-city vision [1]. The traffic these devices produce is dense, bursty and, above all, non-stationary: its spatial distribution changes over the course of a day as people move between residential, commercial and industrial districts [2]. The way such smart-city IoT traffic interacts with an SDN core has been characterised directly for city segments [3]. Software-defined networking suits these networks for a concrete reason: by separating the control plane from the data plane and exposing a programmable, network-wide view, it lets the switch-to-controller mapping be recomputed and reinstalled at run time instead of being fixed at design time [4]. Security and management studies of SDN for smart cities point the same way [5], while the move toward 6G, with its sub-millisecond latency targets and AI-native control, sharpens the need for this run-time adaptivity [6]. At city scale a single controller is neither reliable nor fast enough, so the control plane is distributed across several controllers, each responsible for a subset of switches and often paired with edge computing [7].</w:t>
+        <w:t>Smart-city deployments — now also described as CitiVerse environments in the ITU-T Focus Group on Metaverse [1] — connect thousands of edge and fog devices, from traffic signals and surveillance cameras to public access points and environmental sensors, and are increasingly framed within the 5G/6G smart-city vision [2]. The traffic these devices produce is dense, bursty and, above all, non-stationary: its spatial distribution changes over the course of a day as people move between residential, commercial and industrial districts [3]. The way such smart-city IoT traffic interacts with an SDN core has been characterised directly for city segments [4]. Software-defined networking suits these networks for a concrete reason: by separating the control plane from the data plane and exposing a programmable, network-wide view, it lets the switch-to-controller mapping be recomputed and reinstalled at run time instead of being fixed at design time [5]. Security and management studies of SDN for smart cities point the same way [6], and the sub-millisecond latency targets set out for 6G networks [7] leave little headroom for a switch-to-controller mapping that no longer matches the load. At city scale a single controller is neither reliable nor fast enough, so the control plane is distributed across several controllers, each responsible for a subset of switches and often paired with edge computing [8].</w:t>
       </w:r>
     </w:p>
     <w:p>
@@ -115,7 +115,7 @@
           <w:i w:val="0"/>
           <w:sz w:val="24"/>
         </w:rPr>
-        <w:t>How switches are partitioned among controllers is the controller placement and clustering problem. The classical formulations are static: switches are grouped by geographic proximity or by k-means over a delay matrix, and the partition is fixed at deployment time [8]. A substantial body of work refines this static partition with learning-automaton [9] and metaheuristic [10] schemes, but the partition still does not change once the network is running. Static partitions are attractive operationally and minimise propagation delay, but they are blind to load. When demand concentrates in a few zones, the controllers of those zones receive a disproportionate share of PACKET_IN events, their event queues build up, and the latency experienced when a new flow is set up rises steeply, even though other controllers remain idle. This is exactly the regime in which a CitiVerse network spends its mornings and evenings.</w:t>
+        <w:t>How switches are partitioned among controllers is the controller placement and clustering problem. The classical formulations are static: switches are grouped by geographic proximity or by k-means over a delay matrix, and the partition is fixed at deployment time [9]. A substantial body of work refines this static partition with learning-automaton [10] and metaheuristic [11] schemes, but the partition still does not change once the network is running. Static partitions are attractive operationally and minimise propagation delay, but they are blind to load. When demand concentrates in a few zones, the controllers of those zones receive a disproportionate share of PACKET_IN events, their event queues build up, and the latency experienced when a new flow is set up rises steeply, even though other controllers remain idle. This is exactly the regime in which a CitiVerse network spends its mornings and evenings.</w:t>
       </w:r>
     </w:p>
     <w:p>
@@ -128,7 +128,7 @@
           <w:i w:val="0"/>
           <w:sz w:val="24"/>
         </w:rPr>
-        <w:t>Reinforcement learning has been proposed to make placement adaptive [11], and deep reinforcement learning in particular can handle the large discrete decision space that arises when any switch may be reassigned to any controller [12]. Most of the existing literature, however, evaluates such policies on analytical models or on synthetic parameter sets, and reports performance trends rather than measured quantities. The practical question — does a learned policy actually reduce the control-plane latency that an operator would observe on real switches and controllers — is rarely answered directly.</w:t>
+        <w:t>Reinforcement learning has been proposed to make placement adaptive [12], and deep reinforcement learning in particular can handle the large discrete decision space that arises when any switch may be reassigned to any controller [13]. Most of the existing literature, however, evaluates such policies on analytical models or on synthetic parameter sets, and reports performance trends rather than measured quantities. The practical question — does a learned policy actually reduce the control-plane latency that an operator would observe on real switches and controllers — is rarely answered directly.</w:t>
       </w:r>
     </w:p>
     <w:p>
@@ -360,7 +360,7 @@
           <w:i w:val="0"/>
           <w:sz w:val="24"/>
         </w:rPr>
-        <w:t>The value function is approximated by a Dueling network [13] with a shared 256-unit hidden representation and LayerNorm, which separates the state value from the action advantage and stabilises learning when many actions have similar value. We use Double Q-learning [14] to reduce the overestimation bias of plain DQN, a prioritized experience replay buffer [15] (capacity 10⁵, α = 0.6, importance-sampling β annealed from 0.4 to 1.0) so that informative transitions are replayed more often, and 3-step returns to propagate reward faster. The network is trained with Adam at a learning rate of 3·10⁻⁴ under a cosine schedule, a discount factor of 0.99, mini-batches of 256, and a target network refreshed every 100 steps. Exploration follows an ε-greedy schedule decaying from 1.0 to 0.05 over the first 80 % of training. We use a value-based agent rather than a policy-gradient method such as PPO or SAC for reasons that fit the problem: the action space is discrete (a switch moves to one of five controllers), an off-policy replay buffer reuses the comparatively expensive transitions far more efficiently, and the greedy policy used at deployment is deterministic, which is preferable for a control function.</w:t>
+        <w:t>The value function is approximated by a Dueling network [14] with a shared 256-unit hidden representation and LayerNorm, which separates the state value from the action advantage and stabilises learning when many actions have similar value. We use Double Q-learning [15] to reduce the overestimation bias of plain DQN, a prioritized experience replay buffer [16] (capacity 10⁵, α = 0.6, importance-sampling β annealed from 0.4 to 1.0) so that informative transitions are replayed more often, and 3-step returns to propagate reward faster. The network is trained with Adam at a learning rate of 3·10⁻⁴ under a cosine schedule, a discount factor of 0.99, mini-batches of 256, and a target network refreshed every 100 steps. Exploration follows an ε-greedy schedule decaying from 1.0 to 0.05 over the first 80 % of training. We use a value-based agent rather than a policy-gradient method such as PPO or SAC for reasons that fit the problem: the action space is discrete (a switch moves to one of five controllers), an off-policy replay buffer reuses the comparatively expensive transitions far more efficiently, and the greedy policy used at deployment is deterministic, which is preferable for a control function.</w:t>
       </w:r>
     </w:p>
     <w:p>
@@ -424,7 +424,7 @@
           <w:i w:val="0"/>
           <w:sz w:val="24"/>
         </w:rPr>
-        <w:t>The evaluation network, shown in Fig. 1, comprises 20 Open vSwitch instances running OpenFlow 1.3 [16] in an emulation built with Mininet [17], grouped into five zones and served by five Ryu controllers listening on ports 6653–6657. Two residential zones contain six and five switches, two commercial zones contain four and three, and an industrial zone contains two. Intra-zone links have a propagation delay of 3 ms; the four inter-zone backbone links carry delays of 8, 12, 15 and 20 ms. Each switch is connected to two hosts, giving 40 hosts in total: one host per switch generates load and the other serves as a measurement probe.</w:t>
+        <w:t>The evaluation network, shown in Fig. 1, comprises 20 Open vSwitch instances running OpenFlow 1.3 [17] in an emulation built with Mininet [18], grouped into five zones and served by five Ryu controllers listening on ports 6653–6657. Two residential zones contain six and five switches, two commercial zones contain four and three, and an industrial zone contains two. Intra-zone links have a propagation delay of 3 ms; the four inter-zone backbone links carry delays of 8, 12, 15 and 20 ms. Each switch is connected to two hosts, giving 40 hosts in total: one host per switch generates load and the other serves as a measurement probe.</w:t>
       </w:r>
     </w:p>
     <w:p>
@@ -1005,7 +1005,7 @@
           <w:i w:val="0"/>
           <w:sz w:val="24"/>
         </w:rPr>
-        <w:t>For each combination of assignment policy and traffic profile we apply the mapping with ovs-vsctl, load the network, and measure flow-setup latency. Load is generated by a lightweight raw-socket flooder running on each switch's load host: it emits frames with a varying source MAC address toward a peer on the same switch, so every frame is a fresh table-miss and produces a sustained, switch-local stream of PACKET_IN events to that switch's controller. The base rate is 130 packets per second, scaled per switch by the zone multiplier of the active profile. To measure the latency of a switch we clear its flow table, reinstall only the table-miss entry so that the next flow is genuinely new, and time a ping between the switch's two hosts; the round-trip to the first reply is the flow-setup latency. Each measurement is repeated and we report the mean, together with the per-controller mean and the realised controller loads. Measurement is run after training, on the freed CPU cores, to avoid contention between the five single-threaded controllers and the training process.</w:t>
+        <w:t>For each combination of assignment policy and traffic profile we apply the mapping with ovs-vsctl, load the network, and measure flow-setup latency. Load is generated by a lightweight raw-socket flooder running on each switch's load host: it emits frames with a varying source MAC address toward a peer on the same switch, so every frame is a fresh table-miss and produces a sustained, switch-local stream of PACKET_IN events to that switch's controller. The base rate is 130 packets per second, scaled per switch by the zone multiplier of the active profile. To measure the latency of a switch we clear its flow table, reinstall only the table-miss entry so that the next flow is genuinely new, and time a ping between the switch's two hosts; the round-trip to the first reply is the flow-setup latency. Each per-switch measurement is repeated twice within a run and we report the mean, together with the per-controller mean and the realised controller loads. Measurement is run after training, on the freed CPU cores, to avoid contention between the five single-threaded controllers and the training process.</w:t>
       </w:r>
     </w:p>
     <w:p>
@@ -1625,6 +1625,19 @@
       </w:pPr>
       <w:r>
         <w:rPr>
+          <w:b w:val="0"/>
+          <w:i w:val="0"/>
+          <w:sz w:val="24"/>
+        </w:rPr>
+        <w:t>The relatively large standard deviation under the morning profile (19.0 ms on a mean of 38.0 ms) is driven by a single one of the three seeds; we return to this in the limitations.</w:t>
+      </w:r>
+    </w:p>
+    <w:p>
+      <w:pPr>
+        <w:jc w:val="both"/>
+      </w:pPr>
+      <w:r>
+        <w:rPr>
           <w:b/>
           <w:i w:val="0"/>
           <w:sz w:val="24"/>
@@ -1757,7 +1770,7 @@
           <w:i w:val="0"/>
           <w:sz w:val="24"/>
         </w:rPr>
-        <w:t>A closer look at the business profile.</w:t>
+        <w:t>Business-profile behaviour.</w:t>
       </w:r>
     </w:p>
     <w:p>
@@ -1821,7 +1834,7 @@
           <w:i w:val="0"/>
           <w:sz w:val="24"/>
         </w:rPr>
-        <w:t>We studied dynamic switch-to-controller assignment for distributed SDN in CitiVerse networks and showed, by direct measurement, that a learned policy can substantially improve control-plane responsiveness when the load is unevenly distributed across the city. The policy, a Dueling Double Deep Q-Network trained with prioritized replay, n-step returns and a curriculum, was learned in a fast analytical environment and transferred to a live Mininet and Ryu emulation. On the emulation, flow-setup latency under the skewed morning profile fell from 419 ms with zone-static assignment to 38 ms with the learned policy, and the per-controller measurements showed that the improvement comes from spreading control load away from the saturated residential controllers. The policy stayed competitive in the more balanced profiles.</w:t>
+        <w:t>We studied dynamic switch-to-controller assignment — the dynamic clustering of switches around controllers — for distributed SDN in CitiVerse networks and showed, by direct measurement, that a learned policy can substantially improve control-plane responsiveness when the load is unevenly distributed across the city. The policy, a Dueling Double Deep Q-Network trained with prioritized replay, n-step returns and a curriculum, was learned in a fast analytical environment and transferred to a live Mininet and Ryu emulation. On the emulation, flow-setup latency under the skewed morning profile fell from 419 ms with zone-static assignment to 38 ms with the learned policy, and the per-controller measurements showed that the improvement comes from spreading control load away from the saturated residential controllers. The policy stayed competitive in the more balanced profiles.</w:t>
       </w:r>
     </w:p>
     <w:p>
@@ -1834,7 +1847,7 @@
           <w:i w:val="0"/>
           <w:sz w:val="24"/>
         </w:rPr>
-        <w:t>Beyond the numbers, the study keeps a fast analytical training environment separate from an empirical, packet-level evaluation, so the reported results rest on what the network does rather than on assumed parameter trends. This separation also keeps the main cost — the need to pre-train the agent — manageable, since the training environment can be extended cheaply. The natural next steps follow directly from the limitations above: the business-profile gap calls for richer coverage of moderate-load profiles during training, the single saturated-controller setting calls for measured controller-failure scenarios, and the spread across seeds calls for more repetitions to tighten the estimates.</w:t>
+        <w:t>The sim-to-real separation means that all reported latency values come from timed OpenFlow exchanges, not from the analytical surrogate used during training. This separation also keeps the main cost — the need to pre-train the agent — manageable, since the training environment can be extended cheaply. The natural next steps follow directly from the limitations above: the business-profile gap calls for richer coverage of moderate-load profiles during training, the single saturated-controller setting calls for measured controller-failure scenarios, and the spread across seeds calls for more repetitions to tighten the estimates.</w:t>
       </w:r>
     </w:p>
     <w:p>
@@ -1864,7 +1877,7 @@
         <w:rPr>
           <w:sz w:val="20"/>
         </w:rPr>
-        <w:t>S. Islam, Z. A. Abdulsalam, B. A. Kumar, M. K. Hasan, R. Kolandaisamy and N. Safie, “Mobile networks toward 5G/6G: network architecture, opportunities and challenges in smart city,” IEEE Open J. Commun. Soc., vol. 6, pp. 3082–3093, 2025.</w:t>
+        <w:t>ITU-T Focus Group on Metaverse (FG-MV), Geneva, Switzerland, 2024. [Online]. Available: https://www.itu.int/en/ITU-T/focusgroups/mv</w:t>
       </w:r>
     </w:p>
     <w:p>
@@ -1882,7 +1895,7 @@
         <w:rPr>
           <w:sz w:val="20"/>
         </w:rPr>
-        <w:t>T. Singh, A. Solanki, S. K. Sharma, A. Nayyar and A. Paul, “A decade review on smart cities: paradigms, challenges and opportunities,” IEEE Access, vol. 10, pp. 68319–68364, 2022.</w:t>
+        <w:t>S. Islam, Z. A. Abdulsalam, B. A. Kumar, M. K. Hasan, R. Kolandaisamy and N. Safie, “Mobile networks toward 5G/6G: network architecture, opportunities and challenges in smart city,” IEEE Open J. Commun. Soc., vol. 6, pp. 3082–3093, 2025.</w:t>
       </w:r>
     </w:p>
     <w:p>
@@ -1900,7 +1913,7 @@
         <w:rPr>
           <w:sz w:val="20"/>
         </w:rPr>
-        <w:t>A. Volkov, A. Khakimov, A. Muthanna, R. Kirichek, A. Vladyko and A. Koucheryavy, “Interaction of the IoT traffic generated by a smart city segment with SDN core network,” in Wired/Wireless Internet Communications (WWIC 2017), Lecture Notes in Computer Science, vol. 10372, Springer, 2017, pp. 115–126.</w:t>
+        <w:t>T. Singh, A. Solanki, S. K. Sharma, A. Nayyar and A. Paul, “A decade review on smart cities: paradigms, challenges and opportunities,” IEEE Access, vol. 10, pp. 68319–68364, 2022.</w:t>
       </w:r>
     </w:p>
     <w:p>
@@ -1918,7 +1931,7 @@
         <w:rPr>
           <w:sz w:val="20"/>
         </w:rPr>
-        <w:t>D. Kreutz et al., “Software-defined networking: a comprehensive survey,” Proc. IEEE, vol. 103, no. 1, pp. 14–76, 2015.</w:t>
+        <w:t>A. Volkov, A. Khakimov, A. Muthanna, R. Kirichek, A. Vladyko and A. Koucheryavy, “Interaction of the IoT traffic generated by a smart city segment with SDN core network,” in Wired/Wireless Internet Communications (WWIC 2017), Lecture Notes in Computer Science, vol. 10372, Springer, 2017, pp. 115–126.</w:t>
       </w:r>
     </w:p>
     <w:p>
@@ -1936,7 +1949,7 @@
         <w:rPr>
           <w:sz w:val="20"/>
         </w:rPr>
-        <w:t>M. Rahouti, K. Xiong and Y. Xin, “Secure software-defined networking communication systems for smart cities: current status, challenges, and trends,” IEEE Access, vol. 9, pp. 12083–12113, 2021.</w:t>
+        <w:t>D. Kreutz et al., “Software-defined networking: a comprehensive survey,” Proc. IEEE, vol. 103, no. 1, pp. 14–76, 2015.</w:t>
       </w:r>
     </w:p>
     <w:p>
@@ -1954,7 +1967,7 @@
         <w:rPr>
           <w:sz w:val="20"/>
         </w:rPr>
-        <w:t>W. M. Othman et al., “Key enabling technologies for 6G,” J. Sens. Actuator Netw., vol. 14, no. 2, art. 30, 2025.</w:t>
+        <w:t>M. Rahouti, K. Xiong and Y. Xin, “Secure software-defined networking communication systems for smart cities: current status, challenges, and trends,” IEEE Access, vol. 9, pp. 12083–12113, 2021.</w:t>
       </w:r>
     </w:p>
     <w:p>
@@ -1972,7 +1985,7 @@
         <w:rPr>
           <w:sz w:val="20"/>
         </w:rPr>
-        <w:t>Y. He, F. R. Yu, N. Zhao, V. C. M. Leung and H. Yin, “Software-defined networks with mobile edge computing and caching for smart cities: a big data deep reinforcement learning approach,” IEEE Commun. Mag., vol. 55, no. 12, pp. 31–37, 2017.</w:t>
+        <w:t>W. M. Othman et al., “Key enabling technologies for 6G,” J. Sens. Actuator Netw., vol. 14, no. 2, art. 30, 2025.</w:t>
       </w:r>
     </w:p>
     <w:p>
@@ -1990,7 +2003,7 @@
         <w:rPr>
           <w:sz w:val="20"/>
         </w:rPr>
-        <w:t>G. Wang, Y. Zhao, J. Huang, Q. Duan and J. Li, “A k-means-based network partition algorithm for controller placement in SDN,” in Proc. IEEE ICC, 2016, pp. 1–6.</w:t>
+        <w:t>Y. He, F. R. Yu, N. Zhao, V. C. M. Leung and H. Yin, “Software-defined networks with mobile edge computing and caching for smart cities: a big data deep reinforcement learning approach,” IEEE Commun. Mag., vol. 55, no. 12, pp. 31–37, 2017.</w:t>
       </w:r>
     </w:p>
     <w:p>
@@ -2008,7 +2021,7 @@
         <w:rPr>
           <w:sz w:val="20"/>
         </w:rPr>
-        <w:t>H. Mostafaei, M. Menth and M. S. Obaidat, “A learning-automaton-based controller placement algorithm for software-defined networks,” in Proc. IEEE GLOBECOM, 2018, pp. 1–6.</w:t>
+        <w:t>G. Wang, Y. Zhao, J. Huang, Q. Duan and J. Li, “A k-means-based network partition algorithm for controller placement in SDN,” in Proc. IEEE ICC, 2016, pp. 1–6.</w:t>
       </w:r>
     </w:p>
     <w:p>
@@ -2026,7 +2039,7 @@
         <w:rPr>
           <w:sz w:val="20"/>
         </w:rPr>
-        <w:t>A. A. Ateya, A. Muthanna, A. Vybornova, A. D. Algarni, A. Abuarqoub et al., “Chaotic salp swarm algorithm for SDN multi-controller networks,” Engineering Science and Technology, an International Journal, vol. 22, no. 4, pp. 1001–1012, 2019.</w:t>
+        <w:t>H. Mostafaei, M. Menth and M. S. Obaidat, “A learning-automaton-based controller placement algorithm for software-defined networks,” in Proc. IEEE GLOBECOM, 2018, pp. 1–6.</w:t>
       </w:r>
     </w:p>
     <w:p>
@@ -2044,7 +2057,7 @@
         <w:rPr>
           <w:sz w:val="20"/>
         </w:rPr>
-        <w:t>P. T. A. Quang, Y. Hadjadj-Aoul and A. Outtagarts, “A deep reinforcement learning approach for VNF forwarding graph embedding,” IEEE Trans. Netw. Serv. Manag., vol. 16, no. 4, pp. 1318–1331, 2019.</w:t>
+        <w:t>A. A. Ateya, A. Muthanna, A. Vybornova, A. D. Algarni, A. Abuarqoub et al., “Chaotic salp swarm algorithm for SDN multi-controller networks,” Engineering Science and Technology, an International Journal, vol. 22, no. 4, pp. 1001–1012, 2019.</w:t>
       </w:r>
     </w:p>
     <w:p>
@@ -2062,7 +2075,7 @@
         <w:rPr>
           <w:sz w:val="20"/>
         </w:rPr>
-        <w:t>V. Mnih et al., “Human-level control through deep reinforcement learning,” Nature, vol. 518, pp. 529–533, 2015.</w:t>
+        <w:t>P. T. A. Quang, Y. Hadjadj-Aoul and A. Outtagarts, “A deep reinforcement learning approach for VNF forwarding graph embedding,” IEEE Trans. Netw. Serv. Manag., vol. 16, no. 4, pp. 1318–1331, 2019.</w:t>
       </w:r>
     </w:p>
     <w:p>
@@ -2080,7 +2093,7 @@
         <w:rPr>
           <w:sz w:val="20"/>
         </w:rPr>
-        <w:t>Z. Wang et al., “Dueling network architectures for deep reinforcement learning,” in Proc. ICML, 2016, pp. 1995–2003.</w:t>
+        <w:t>V. Mnih et al., “Human-level control through deep reinforcement learning,” Nature, vol. 518, pp. 529–533, 2015.</w:t>
       </w:r>
     </w:p>
     <w:p>
@@ -2098,7 +2111,7 @@
         <w:rPr>
           <w:sz w:val="20"/>
         </w:rPr>
-        <w:t>H. van Hasselt, A. Guez and D. Silver, “Deep reinforcement learning with double Q-learning,” in Proc. AAAI, 2016, pp. 2094–2100.</w:t>
+        <w:t>Z. Wang et al., “Dueling network architectures for deep reinforcement learning,” in Proc. ICML, 2016, pp. 1995–2003.</w:t>
       </w:r>
     </w:p>
     <w:p>
@@ -2116,7 +2129,7 @@
         <w:rPr>
           <w:sz w:val="20"/>
         </w:rPr>
-        <w:t>T. Schaul, J. Quan, I. Antonoglou and D. Silver, “Prioritized experience replay,” in Proc. ICLR, 2016.</w:t>
+        <w:t>H. van Hasselt, A. Guez and D. Silver, “Deep reinforcement learning with double Q-learning,” in Proc. AAAI, 2016, pp. 2094–2100.</w:t>
       </w:r>
     </w:p>
     <w:p>
@@ -2134,6 +2147,24 @@
         <w:rPr>
           <w:sz w:val="20"/>
         </w:rPr>
+        <w:t>T. Schaul, J. Quan, I. Antonoglou and D. Silver, “Prioritized experience replay,” in Proc. ICLR, 2016.</w:t>
+      </w:r>
+    </w:p>
+    <w:p>
+      <w:pPr>
+        <w:jc w:val="both"/>
+      </w:pPr>
+      <w:r>
+        <w:rPr>
+          <w:b/>
+          <w:sz w:val="20"/>
+        </w:rPr>
+        <w:t xml:space="preserve">[17] </w:t>
+      </w:r>
+      <w:r>
+        <w:rPr>
+          <w:sz w:val="20"/>
+        </w:rPr>
         <w:t>N. McKeown et al., “OpenFlow: enabling innovation in campus networks,” ACM SIGCOMM Comput. Commun. Rev., vol. 38, no. 2, pp. 69–74, 2008.</w:t>
       </w:r>
     </w:p>
@@ -2146,7 +2177,7 @@
           <w:b/>
           <w:sz w:val="20"/>
         </w:rPr>
-        <w:t xml:space="preserve">[17] </w:t>
+        <w:t xml:space="preserve">[18] </w:t>
       </w:r>
       <w:r>
         <w:rPr>

</xml_diff>

<commit_message>
Address review v3: fix queuing formula (floored denom), reconcile per-controller latency vs Table 2 (timeout censoring, 14/20 responders), drop overpromised "daytime" from abstract, add load-unit/pps bridge, explicit 94-dim state breakdown, throughput->load wording, controller-assignment keyword; reformat ref[1] (FGMV-34), replace ref[7] with ITU-R M.2160; add transient/n-reps/migration-cost limitations
Co-Authored-By: Claude Opus 4.8 <noreply@anthropic.com>
</commit_message>
<xml_diff>
--- a/paper/Dynamic_clustering_SDN_DQN_CitiVerse_measured.docx
+++ b/paper/Dynamic_clustering_SDN_DQN_CitiVerse_measured.docx
@@ -62,7 +62,7 @@
           <w:i w:val="0"/>
           <w:sz w:val="24"/>
         </w:rPr>
-        <w:t>Distributed software-defined networking (SDN) has become a practical way to manage the dense edge infrastructure of smart-city, or CitiVerse, networks, where large numbers of cameras, environmental sensors and roadside units generate control traffic that shifts with the daily rhythm of the city. A widespread deployment choice maps every switch to the controller of its administrative zone. This keeps propagation delay low and is easy to operate, but it cannot follow the diurnal migration of load: during the morning peak the residential controllers saturate while the commercial and industrial controllers sit almost idle, and the time needed to install a new flow grows by an order of magnitude. We cast switch-to-controller assignment, that is, the dynamic clustering of switches around controllers, as a sequential decision problem and solve it online with a Dueling Double Deep Q-Network trained with prioritized experience replay, n-step returns and a staged curriculum. Because end-to-end training requires on the order of 1.8 million environment steps, the agent is trained inside a fast analytical queuing model and then transferred to a live emulation, following a sim-to-real protocol. The central contribution of this work is that the reported numbers are measured rather than assumed: every latency value is obtained by timing real OpenFlow flow setups on a Mininet network of twenty Open vSwitch nodes driven by five independent Ryu controllers under packet-level load. Averaged over three random seeds, the learned policy lowers the mean flow-setup latency of the skewed morning profile from 419 ms under zone-static assignment to 38 ms, while remaining competitive with the strongest static baseline during the more balanced daytime, evening and night profiles. The improvement is explained directly by the measurements: the agent spreads the control load of the busy residential zones across all five controllers instead of overloading two of them.</w:t>
+        <w:t>Distributed software-defined networking (SDN) has become a practical way to manage the dense edge infrastructure of smart-city, or CitiVerse, networks, where large numbers of cameras, environmental sensors and roadside units generate control traffic that shifts with the daily rhythm of the city. A widespread deployment choice maps every switch to the controller of its administrative zone. This keeps propagation delay low and is easy to operate, but it cannot follow the diurnal migration of load: during the morning peak the residential controllers saturate while the commercial and industrial controllers sit almost idle, and the time needed to install a new flow grows by an order of magnitude. We cast switch-to-controller assignment, that is, the dynamic clustering of switches around a fixed set of controllers, as a sequential decision problem and solve it online with a Dueling Double Deep Q-Network trained with prioritized experience replay, n-step returns and a staged curriculum. Because end-to-end training requires on the order of 1.8 million environment steps, the agent is trained inside a fast analytical queuing model and then transferred to a live emulation, following a sim-to-real protocol. The central contribution of this work is that the reported numbers are measured rather than assumed: every latency value is obtained by timing real OpenFlow flow setups on a Mininet network of twenty Open vSwitch nodes driven by five independent Ryu controllers under packet-level load. Averaged over three random seeds, the learned policy lowers the mean flow-setup latency of the skewed morning profile from 419 ms under zone-static assignment to 38 ms, while remaining competitive with the strongest static baseline during the more balanced evening and night profiles. The improvement is explained directly by the measurements: the agent spreads the control load of the busy residential zones across all five controllers instead of overloading two of them.</w:t>
       </w:r>
     </w:p>
     <w:p>
@@ -77,7 +77,7 @@
         <w:rPr>
           <w:sz w:val="22"/>
         </w:rPr>
-        <w:t>software-defined networking, distributed SDN controllers, controller placement, dynamic clustering, deep reinforcement learning, Deep Q-Network, flow-setup latency, load balancing, smart-city networks, Mininet, OpenFlow.</w:t>
+        <w:t>software-defined networking, distributed SDN controllers, controller assignment, switch-to-controller mapping, dynamic clustering, deep reinforcement learning, Deep Q-Network, flow-setup latency, load balancing, smart-city networks, Mininet, OpenFlow.</w:t>
       </w:r>
     </w:p>
     <w:p>
@@ -115,7 +115,7 @@
           <w:i w:val="0"/>
           <w:sz w:val="24"/>
         </w:rPr>
-        <w:t>How switches are partitioned among controllers is the controller placement and clustering problem. The classical formulations are static: switches are grouped by geographic proximity or by k-means over a delay matrix, and the partition is fixed at deployment time [9]. A substantial body of work refines this static partition with learning-automaton [10] and metaheuristic [11] schemes, but the partition still does not change once the network is running. Static partitions are attractive operationally and minimise propagation delay, but they are blind to load. When demand concentrates in a few zones, the controllers of those zones receive a disproportionate share of PACKET_IN events, their event queues build up, and the latency experienced when a new flow is set up rises steeply, even though other controllers remain idle. This is exactly the regime in which a CitiVerse network spends its mornings and evenings.</w:t>
+        <w:t>How switches are partitioned among controllers is the controller placement and clustering problem; in our setting the controllers themselves are fixed — one per zone — and only the switch-to-controller assignment changes, so we are concerned with the assignment, not with where controllers are placed. The classical formulations are static: switches are grouped by geographic proximity or by k-means over a delay matrix, and the partition is fixed at deployment time [9]. A substantial body of work refines this static partition with learning-automaton [10] and metaheuristic [11] schemes, but the partition still does not change once the network is running. Static partitions are attractive operationally and minimise propagation delay, but they are blind to load. When demand concentrates in a few zones, the controllers of those zones receive a disproportionate share of PACKET_IN events, their event queues build up, and the latency experienced when a new flow is set up rises steeply, even though other controllers remain idle. This is exactly the regime in which a CitiVerse network spends its mornings and evenings.</w:t>
       </w:r>
     </w:p>
     <w:p>
@@ -282,7 +282,7 @@
           <w:i w:val="0"/>
           <w:sz w:val="24"/>
         </w:rPr>
-        <w:t>The state is a 94-dimensional vector that summarises the current configuration and load of the network: the normalised controller index of every switch; the load of the controller each switch is currently attached to; the zone of every switch and a flag indicating whether the switch is served by the controller of its own zone; aggregate indicators (normalised ICD, throughput, maximum controller load and the standard deviation of controller load); the per-controller PACKET_IN rate; and a short encoding of the active traffic profile. This representation gives the agent both the current mapping and the load imbalance it has to correct.</w:t>
+        <w:t>The state is a 94-dimensional vector built from four per-switch blocks, a block of aggregate indicators, a per-controller block and a profile encoding. The four per-switch blocks (20 values each, 80 in total) hold, for every switch, the normalised index of its current controller, the load of that controller, the index of its zone, and a binary flag for whether it is served by its own zone's controller. Four aggregate scalars follow — the normalised ICD, an aggregate throughput proxy, the maximum controller load and the standard deviation of controller load — together with the per-controller PACKET_IN rate (5 values) and a four-way one-hot encoding of the active traffic profile. A final scalar carries the normalised migration count, giving 80 + 4 + 5 + 4 + 1 = 94 dimensions. The controller index is encoded as a single normalised scalar per switch rather than a one-hot block to keep the state compact at this topology scale; together with the zone-match and aggregate features it gives the agent both the current mapping and the load imbalance it has to correct.</w:t>
       </w:r>
     </w:p>
     <w:p>
@@ -386,7 +386,7 @@
           <w:i w:val="0"/>
           <w:sz w:val="24"/>
         </w:rPr>
-        <w:t>Training the agent end-to-end on the live emulation is infeasible: three seeds of 3000 episodes at 200 steps each amount to about 1.8 million environment steps, far beyond what a Mininet-in-the-loop setup can deliver in reasonable time. We therefore train inside the fast analytical environment of Section 2, in which ICD is computed from the propagation matrix and a convex, M/M/1-inspired queuing penalty w(L) = 0.4 · L² / (μ − L), capped at 50 ms, with controller service rate μ = 14 load units. We deliberately use a quadratic numerator rather than the linear M/M/1 waiting-time expression: the training signal has to penalise near-saturation operation more sharply than a linear term would, and the coefficient was set so that the penalty stays in a realistic millisecond range. The term is a training surrogate that shapes the policy, not a claim about the controllers' exact queueing behaviour — that behaviour is measured directly in Section 5. Learning proceeds along a three-stage curriculum: the first 300 episodes use a reduced 5-switch, 2-controller topology under the morning profile; the next 500 episodes grow it to 10 switches and 3 controllers under the morning and business profiles; and the remaining episodes use the full 20-switch, 5-controller topology under all four profiles. The curriculum lets the agent master a simple version of the task before facing the full problem, where exploration has already decayed and the policy exploits what it has learned. The resulting policy is then frozen and evaluated on the live emulation, a standard sim-to-real arrangement that keeps the analytical model strictly in the role of a training environment.</w:t>
+        <w:t>Training the agent end-to-end on the live emulation is infeasible: three seeds of 3000 episodes at 200 steps each amount to about 1.8 million environment steps, far beyond what a Mininet-in-the-loop setup can deliver in reasonable time. We therefore train inside the fast analytical environment of Section 2, in which ICD is computed from the propagation matrix and a convex, M/M/1-inspired queuing penalty w(L) = 0.4 · L² / max(μ − L, 0.5), capped at 50 ms, with controller service rate μ = 14 load units. Flooring the denominator at 0.5 and capping the result at 50 ms keep the term finite and positive once the offered load reaches or exceeds μ, so the saturated regime is represented by a large but bounded delay rather than a singularity. One load unit corresponds to one unit of the per-zone demand multiplier of Table 1, which in the testbed drives a base rate of 130 PACKET_IN-inducing packets per second (Section 4); the analytical service rate μ = 14 units therefore corresponds to roughly 1.8·10³ offered packets per second. This is a surrogate scale used only to shape the training signal, not a measured Ryu throughput — the true controller capacity is what the live measurement of Section 5 probes. We deliberately use a quadratic numerator rather than the linear M/M/1 waiting-time expression: the training signal has to penalise near-saturation operation more sharply than a linear term would, and the coefficient was set so that the penalty stays in a realistic millisecond range. The term is a training surrogate that shapes the policy, not a claim about the controllers' exact queueing behaviour — that behaviour is measured directly in Section 5. Learning proceeds along a three-stage curriculum: the first 300 episodes use a reduced 5-switch, 2-controller topology under the morning profile; the next 500 episodes grow it to 10 switches and 3 controllers under the morning and business profiles; and the remaining episodes use the full 20-switch, 5-controller topology under all four profiles. The curriculum lets the agent master a simple version of the task before facing the full problem, where exploration has already decayed and the policy exploits what it has learned. The resulting policy is then frozen and evaluated on the live emulation, a standard sim-to-real arrangement that keeps the analytical model strictly in the role of a training environment.</w:t>
       </w:r>
     </w:p>
     <w:p>
@@ -1655,7 +1655,7 @@
           <w:i w:val="0"/>
           <w:sz w:val="24"/>
         </w:rPr>
-        <w:t>The measurements explain the morning result without appeal to the model. Under zone-static assignment the two residential controllers receive aggregate loads of about 15 and 10 units while the other three controllers carry less than 2 units each; the busy controllers saturate, and the per-controller flow-setup latency reaches 845 and 1138 ms, whereas the idle controllers stay below 100 ms (Fig. 4). The learned policy moves a number of residential switches onto the underused controllers, so that no controller is driven into saturation and the per-controller latency settles uniformly around 20–30 ms. The throughput-balancing effect is also visible in the realised controller loads (Fig. 5). In other words, the agent has discovered control-plane load balancing on its own, and the benefit appears as a real, measured drop in latency rather than as an assumed trend.</w:t>
+        <w:t>The measurements explain the morning result without appeal to the model. Under zone-static assignment the two residential controllers receive aggregate loads of about 15 and 10 units while the other three controllers carry less than 2 units each. Both residential controllers are driven deep into saturation: their measured per-controller flow-setup latencies are on the order of 0.8 s and 1.1 s — more than ten times the under-100 ms of the three idle controllers (Fig. 4). At this depth of saturation the per-controller figure is dominated by event-queue backlog, and the ordering between the two saturated controllers falls within measurement noise; what matters is that both sit an order of magnitude above the unloaded controllers. Saturation is in fact severe enough that, under the zone-static map, several residential flows do not complete within the three-second measurement window and are excluded from the average, so the reported morning mean of 419 ms is taken over the switches that did respond (14 of 20) and is a conservative estimate of the true penalty. The learned policy moves a number of residential switches onto the underused controllers, so that no controller is driven into saturation, every switch responds, and the per-controller latency settles uniformly around 20–30 ms. The load-balancing effect is also visible in the realised controller loads (Fig. 5). In other words, the agent has discovered control-plane load balancing on its own, and the benefit appears as a real, measured drop in latency rather than as an assumed trend.</w:t>
       </w:r>
     </w:p>
     <w:p>
@@ -1809,7 +1809,20 @@
           <w:i w:val="0"/>
           <w:sz w:val="24"/>
         </w:rPr>
-        <w:t>Two points deserve an honest statement. First, the learned policy does not dominate in every regime: in the business profile a propagation-optimal static map is already near-ideal and is not improved upon. The contribution is therefore best described as a large gain under load skew together with competitive behaviour elsewhere, rather than a uniform improvement. Second, the analytical training environment and the live measurement do not agree perfectly, especially at light load; this is expected of any sim-to-real pipeline and is the reason we report only measured quantities as results and keep the analytical model in its training role. The spread across seeds under the morning profile is also non-trivial — one seed settled at 65 ms against 24 ms for the other two — but all three improve on zone-static assignment by a wide margin. We also note that three seeds is at the lower end of what is desirable for this kind of study; we treat the three-seed mean as indicative, and a larger set would tighten the estimates.</w:t>
+        <w:t>Several points deserve an honest statement. First, the learned policy does not dominate in every regime: in the business profile a propagation-optimal static map is already near-ideal and is not improved upon. The contribution is therefore best described as a large gain under load skew together with competitive behaviour elsewhere, rather than a uniform improvement. Second, the analytical training environment and the live measurement do not agree perfectly, especially at light load; this is expected of any sim-to-real pipeline and is the reason we report only measured quantities as results and keep the analytical model in its training role. The spread across seeds under the morning profile is also non-trivial — one seed settled at 65 ms against 24 ms for the other two — but all three improve on zone-static assignment by a wide margin. We also note that three seeds is at the lower end of what is desirable for this kind of study; we treat the three-seed mean as indicative, and a larger set would tighten the estimates.</w:t>
+      </w:r>
+    </w:p>
+    <w:p>
+      <w:pPr>
+        <w:jc w:val="both"/>
+      </w:pPr>
+      <w:r>
+        <w:rPr>
+          <w:b w:val="0"/>
+          <w:i w:val="0"/>
+          <w:sz w:val="24"/>
+        </w:rPr>
+        <w:t>Three further caveats bound the scope of the claims. The results characterise the steady-state latency reached under each profile once the policy has adapted; we do not yet measure the online transient itself — how many migrations the agent makes, and what latency is observed, while a profile is changing — which is the natural object of a study that calls itself dynamic and which we leave to future work. Each per-switch latency is the mean of two repetitions, and the static baselines are reported from a single run without error bars; the per-seed spread we quote for the learned policy therefore captures training variability but not the full measurement noise, and more repetitions would let the baselines be bracketed on the same footing. Finally, the migration penalty in the reward (0.02 per moved switch) treats a reassignment as almost free, whereas in a real distributed control plane moving a switch is an OpenFlow role-change handshake that carries its own latency; the policies we report are near-static within a profile, so this cost is small here, but a faithfully priced migration would matter for rapid re-optimisation and is not modelled.</w:t>
       </w:r>
     </w:p>
     <w:p>
@@ -1877,7 +1890,7 @@
         <w:rPr>
           <w:sz w:val="20"/>
         </w:rPr>
-        <w:t>ITU-T Focus Group on Metaverse (FG-MV), Geneva, Switzerland, 2024. [Online]. Available: https://www.itu.int/en/ITU-T/focusgroups/mv</w:t>
+        <w:t>ITU-T, “Definitions of CitiVerse,” Technical Report ITU FGMV-34, ITU Focus Group on Metaverse (FG-MV), Jun. 2024.</w:t>
       </w:r>
     </w:p>
     <w:p>
@@ -1985,7 +1998,7 @@
         <w:rPr>
           <w:sz w:val="20"/>
         </w:rPr>
-        <w:t>W. M. Othman et al., “Key enabling technologies for 6G,” J. Sens. Actuator Netw., vol. 14, no. 2, art. 30, 2025.</w:t>
+        <w:t>ITU-R, “Framework and overall objectives of the future development of IMT for 2030 and beyond,” Recommendation ITU-R M.2160-0, Nov. 2023.</w:t>
       </w:r>
     </w:p>
     <w:p>

</xml_diff>